<commit_message>
feat(core): add DOCX IR 1.4 with font handling and table layout
- Add font resource management with DOCSIGHT_FONT_DIR and FONT_UNAVAILABLE exit code
- Introduce numbering system for DOCX structural elements
- Add docsight-fonts crate with Liberation font family (Sans, Serif, Mono)
- Implement table layout and pagination with merged cell support
- Enhance IR contract to include inline runs, font properties, and cell formatting
- Add docx_fidelity_cli and validation_fixtures test suites
- Update agent protocol documentation for IR 1.4 specifications
- Add validation fixtures for tables, merged cells, and report documents
- Update conformance and interaction-economy test expectations
- Revise backlog tracking to reference implementation plan documentation
- Ensure validation documents contain only generic, fictional data per security guidelines
</commit_message>
<xml_diff>
--- a/fixtures/validation/sample_headings.docx
+++ b/fixtures/validation/sample_headings.docx
@@ -7,13 +7,13 @@
         <w:pStyle w:val="Heading2"/>
         <w:spacing w:before="200" w:after="0"/>
         <w:rPr>
-          <w:rFonts w:ascii="Times New Roman" w:hAnsi="Times New Roman" w:eastAsia="Times New Roman" w:cs="Times New Roman"/>
+          <w:rFonts w:ascii="Liberation Serif" w:hAnsi="Liberation Serif" w:eastAsia="Liberation Serif" w:cs="Liberation Serif"/>
           <w:color w:val="000000"/>
         </w:rPr>
       </w:pPr>
       <w:r>
         <w:rPr>
-          <w:rFonts w:eastAsia="Times New Roman" w:cs="Times New Roman" w:ascii="Times New Roman" w:hAnsi="Times New Roman"/>
+          <w:rFonts w:eastAsia="Liberation Serif" w:cs="Liberation Serif" w:ascii="Liberation Serif" w:hAnsi="Liberation Serif"/>
           <w:color w:val="000000"/>
         </w:rPr>
         <w:t>Application Architecture Guide</w:t>
@@ -23,13 +23,13 @@
       <w:pPr>
         <w:pStyle w:val="normal1"/>
         <w:rPr>
-          <w:rFonts w:ascii="Times New Roman" w:hAnsi="Times New Roman" w:eastAsia="Times New Roman" w:cs="Times New Roman"/>
+          <w:rFonts w:ascii="Liberation Serif" w:hAnsi="Liberation Serif" w:eastAsia="Liberation Serif" w:cs="Liberation Serif"/>
           <w:color w:val="000000"/>
         </w:rPr>
       </w:pPr>
       <w:r>
         <w:rPr>
-          <w:rFonts w:eastAsia="Times New Roman" w:cs="Times New Roman" w:ascii="Times New Roman" w:hAnsi="Times New Roman"/>
+          <w:rFonts w:eastAsia="Liberation Serif" w:cs="Liberation Serif" w:ascii="Liberation Serif" w:hAnsi="Liberation Serif"/>
           <w:color w:val="000000"/>
         </w:rPr>
       </w:r>
@@ -42,7 +42,7 @@
       <w:r>
         <w:rPr>
           <w:rStyle w:val="Strong"/>
-          <w:rFonts w:eastAsia="Times New Roman" w:cs="Times New Roman" w:ascii="Times New Roman" w:hAnsi="Times New Roman"/>
+          <w:rFonts w:eastAsia="Liberation Serif" w:cs="Liberation Serif" w:ascii="Liberation Serif" w:hAnsi="Liberation Serif"/>
           <w:sz w:val="26"/>
           <w:szCs w:val="26"/>
         </w:rPr>
@@ -77,7 +77,7 @@
       <w:r>
         <w:rPr>
           <w:rStyle w:val="Strong"/>
-          <w:rFonts w:eastAsia="Times New Roman" w:cs="Times New Roman" w:ascii="Times New Roman" w:hAnsi="Times New Roman"/>
+          <w:rFonts w:eastAsia="Liberation Serif" w:cs="Liberation Serif" w:ascii="Liberation Serif" w:hAnsi="Liberation Serif"/>
           <w:sz w:val="26"/>
           <w:szCs w:val="26"/>
         </w:rPr>
@@ -102,7 +102,7 @@
       <w:r>
         <w:rPr>
           <w:rStyle w:val="Strong"/>
-          <w:rFonts w:eastAsia="Times New Roman" w:cs="Times New Roman" w:ascii="Times New Roman" w:hAnsi="Times New Roman"/>
+          <w:rFonts w:eastAsia="Liberation Serif" w:cs="Liberation Serif" w:ascii="Liberation Serif" w:hAnsi="Liberation Serif"/>
           <w:sz w:val="26"/>
           <w:szCs w:val="26"/>
         </w:rPr>
@@ -169,7 +169,7 @@
       <w:r>
         <w:rPr>
           <w:rStyle w:val="Strong"/>
-          <w:rFonts w:eastAsia="Times New Roman" w:cs="Times New Roman" w:ascii="Times New Roman" w:hAnsi="Times New Roman"/>
+          <w:rFonts w:eastAsia="Liberation Serif" w:cs="Liberation Serif" w:ascii="Liberation Serif" w:hAnsi="Liberation Serif"/>
           <w:color w:val="000000"/>
         </w:rPr>
         <w:t xml:space="preserve">- </w:t>
@@ -177,7 +177,7 @@
       <w:r>
         <w:rPr>
           <w:rStyle w:val="Strong"/>
-          <w:rFonts w:eastAsia="Times New Roman" w:cs="Times New Roman"/>
+          <w:rFonts w:eastAsia="Liberation Serif" w:cs="Liberation Serif"/>
           <w:color w:val="000000"/>
         </w:rPr>
         <w:t xml:space="preserve">Serviços em Segundo Plano:  </w:t>
@@ -185,7 +185,7 @@
       <w:r>
         <w:rPr>
           <w:rStyle w:val="Strong"/>
-          <w:rFonts w:eastAsia="Times New Roman" w:cs="Times New Roman"/>
+          <w:rFonts w:eastAsia="Liberation Serif" w:cs="Liberation Serif"/>
           <w:b w:val="false"/>
           <w:bCs w:val="false"/>
           <w:color w:val="000000"/>
@@ -201,7 +201,7 @@
       <w:r>
         <w:rPr>
           <w:rStyle w:val="Strong"/>
-          <w:rFonts w:eastAsia="Times New Roman" w:cs="Times New Roman"/>
+          <w:rFonts w:eastAsia="Liberation Serif" w:cs="Liberation Serif"/>
           <w:b w:val="false"/>
           <w:bCs w:val="false"/>
           <w:color w:val="000000"/>
@@ -239,7 +239,7 @@
       <w:r>
         <w:rPr>
           <w:rStyle w:val="Strong"/>
-          <w:rFonts w:eastAsia="Times New Roman" w:cs="Times New Roman" w:ascii="Cambria" w:hAnsi="Cambria"/>
+          <w:rFonts w:eastAsia="Liberation Serif" w:cs="Liberation Serif" w:ascii="Liberation Serif" w:hAnsi="Liberation Serif"/>
           <w:b/>
           <w:bCs/>
           <w:i w:val="false"/>
@@ -267,7 +267,7 @@
       <w:r>
         <w:rPr>
           <w:rStyle w:val="Strong"/>
-          <w:rFonts w:eastAsia="Times New Roman" w:cs="Times New Roman" w:ascii="Cambria" w:hAnsi="Cambria"/>
+          <w:rFonts w:eastAsia="Liberation Serif" w:cs="Liberation Serif" w:ascii="Liberation Serif" w:hAnsi="Liberation Serif"/>
           <w:b/>
           <w:bCs/>
           <w:i w:val="false"/>
@@ -295,7 +295,7 @@
       <w:r>
         <w:rPr>
           <w:rStyle w:val="Strong"/>
-          <w:rFonts w:eastAsia="Times New Roman" w:cs="Times New Roman" w:ascii="Cambria" w:hAnsi="Cambria"/>
+          <w:rFonts w:eastAsia="Liberation Serif" w:cs="Liberation Serif" w:ascii="Liberation Serif" w:hAnsi="Liberation Serif"/>
           <w:b/>
           <w:bCs/>
           <w:i w:val="false"/>
@@ -323,7 +323,7 @@
       <w:r>
         <w:rPr>
           <w:rStyle w:val="Strong"/>
-          <w:rFonts w:eastAsia="Times New Roman" w:cs="Times New Roman" w:ascii="Cambria" w:hAnsi="Cambria"/>
+          <w:rFonts w:eastAsia="Liberation Serif" w:cs="Liberation Serif" w:ascii="Liberation Serif" w:hAnsi="Liberation Serif"/>
           <w:b/>
           <w:bCs/>
           <w:i w:val="false"/>
@@ -351,7 +351,7 @@
       <w:r>
         <w:rPr>
           <w:rStyle w:val="Strong"/>
-          <w:rFonts w:eastAsia="Times New Roman" w:cs="Times New Roman" w:ascii="Cambria" w:hAnsi="Cambria"/>
+          <w:rFonts w:eastAsia="Liberation Serif" w:cs="Liberation Serif" w:ascii="Liberation Serif" w:hAnsi="Liberation Serif"/>
           <w:b/>
           <w:bCs/>
           <w:i w:val="false"/>
@@ -411,7 +411,7 @@
       <w:r>
         <w:rPr>
           <w:rStyle w:val="Strong"/>
-          <w:rFonts w:eastAsia="Times New Roman" w:cs="Times New Roman"/>
+          <w:rFonts w:eastAsia="Liberation Serif" w:cs="Liberation Serif"/>
           <w:i w:val="false"/>
           <w:iCs w:val="false"/>
           <w:color w:val="000000"/>
@@ -437,7 +437,7 @@
       <w:r>
         <w:rPr>
           <w:rStyle w:val="Strong"/>
-          <w:rFonts w:eastAsia="Times New Roman" w:cs="Times New Roman" w:ascii="Cambria" w:hAnsi="Cambria"/>
+          <w:rFonts w:eastAsia="Liberation Serif" w:cs="Liberation Serif" w:ascii="Liberation Serif" w:hAnsi="Liberation Serif"/>
           <w:b/>
           <w:bCs/>
           <w:i w:val="false"/>
@@ -465,7 +465,7 @@
       <w:r>
         <w:rPr>
           <w:rStyle w:val="Strong"/>
-          <w:rFonts w:eastAsia="Times New Roman" w:cs="Times New Roman" w:ascii="Cambria" w:hAnsi="Cambria"/>
+          <w:rFonts w:eastAsia="Liberation Serif" w:cs="Liberation Serif" w:ascii="Liberation Serif" w:hAnsi="Liberation Serif"/>
           <w:b/>
           <w:bCs/>
           <w:i w:val="false"/>
@@ -493,7 +493,7 @@
       <w:r>
         <w:rPr>
           <w:rStyle w:val="Strong"/>
-          <w:rFonts w:eastAsia="Times New Roman" w:cs="Times New Roman" w:ascii="Cambria" w:hAnsi="Cambria"/>
+          <w:rFonts w:eastAsia="Liberation Serif" w:cs="Liberation Serif" w:ascii="Liberation Serif" w:hAnsi="Liberation Serif"/>
           <w:b/>
           <w:bCs/>
           <w:i w:val="false"/>
@@ -521,7 +521,7 @@
       <w:r>
         <w:rPr>
           <w:rStyle w:val="Strong"/>
-          <w:rFonts w:eastAsia="Times New Roman" w:cs="Times New Roman"/>
+          <w:rFonts w:eastAsia="Liberation Serif" w:cs="Liberation Serif"/>
           <w:i w:val="false"/>
           <w:iCs w:val="false"/>
           <w:color w:val="000000"/>
@@ -547,7 +547,7 @@
       <w:r>
         <w:rPr>
           <w:rStyle w:val="Strong"/>
-          <w:rFonts w:eastAsia="Times New Roman" w:cs="Times New Roman"/>
+          <w:rFonts w:eastAsia="Liberation Serif" w:cs="Liberation Serif"/>
           <w:i w:val="false"/>
           <w:iCs w:val="false"/>
           <w:color w:val="000000"/>
@@ -624,7 +624,7 @@
       <w:r>
         <w:rPr>
           <w:rStyle w:val="Strong"/>
-          <w:rFonts w:eastAsia="Times New Roman" w:cs="Times New Roman" w:ascii="Cambria" w:hAnsi="Cambria"/>
+          <w:rFonts w:eastAsia="Liberation Serif" w:cs="Liberation Serif" w:ascii="Liberation Serif" w:hAnsi="Liberation Serif"/>
           <w:b/>
           <w:bCs/>
           <w:i w:val="false"/>
@@ -653,7 +653,7 @@
       <w:r>
         <w:rPr>
           <w:rStyle w:val="Strong"/>
-          <w:rFonts w:eastAsia="Times New Roman" w:cs="Times New Roman" w:ascii="Cambria" w:hAnsi="Cambria"/>
+          <w:rFonts w:eastAsia="Liberation Serif" w:cs="Liberation Serif" w:ascii="Liberation Serif" w:hAnsi="Liberation Serif"/>
           <w:b/>
           <w:bCs/>
           <w:i w:val="false"/>
@@ -682,7 +682,7 @@
       <w:r>
         <w:rPr>
           <w:rStyle w:val="Strong"/>
-          <w:rFonts w:eastAsia="Times New Roman" w:cs="Times New Roman" w:ascii="Cambria" w:hAnsi="Cambria"/>
+          <w:rFonts w:eastAsia="Liberation Serif" w:cs="Liberation Serif" w:ascii="Liberation Serif" w:hAnsi="Liberation Serif"/>
           <w:b/>
           <w:bCs/>
           <w:i w:val="false"/>
@@ -775,7 +775,7 @@
         <w:ind w:left="2160" w:hanging="360"/>
       </w:pPr>
       <w:rPr>
-        <w:rFonts w:ascii="OpenSymbol" w:hAnsi="OpenSymbol" w:cs="OpenSymbol" w:hint="default"/>
+        <w:rFonts w:ascii="Liberation Sans" w:hAnsi="Liberation Sans" w:cs="Liberation Sans" w:hint="default"/>
         <w:u w:val="none"/>
       </w:rPr>
     </w:lvl>
@@ -823,7 +823,7 @@
         <w:ind w:left="4320" w:hanging="360"/>
       </w:pPr>
       <w:rPr>
-        <w:rFonts w:ascii="OpenSymbol" w:hAnsi="OpenSymbol" w:cs="OpenSymbol" w:hint="default"/>
+        <w:rFonts w:ascii="Liberation Sans" w:hAnsi="Liberation Sans" w:cs="Liberation Sans" w:hint="default"/>
         <w:u w:val="none"/>
       </w:rPr>
     </w:lvl>
@@ -871,7 +871,7 @@
         <w:ind w:left="6480" w:hanging="360"/>
       </w:pPr>
       <w:rPr>
-        <w:rFonts w:ascii="OpenSymbol" w:hAnsi="OpenSymbol" w:cs="OpenSymbol" w:hint="default"/>
+        <w:rFonts w:ascii="Liberation Sans" w:hAnsi="Liberation Sans" w:cs="Liberation Sans" w:hint="default"/>
         <w:u w:val="none"/>
       </w:rPr>
     </w:lvl>
@@ -921,7 +921,7 @@
         <w:ind w:left="2160" w:hanging="360"/>
       </w:pPr>
       <w:rPr>
-        <w:rFonts w:ascii="OpenSymbol" w:hAnsi="OpenSymbol" w:cs="OpenSymbol" w:hint="default"/>
+        <w:rFonts w:ascii="Liberation Sans" w:hAnsi="Liberation Sans" w:cs="Liberation Sans" w:hint="default"/>
         <w:u w:val="none"/>
       </w:rPr>
     </w:lvl>
@@ -969,7 +969,7 @@
         <w:ind w:left="4320" w:hanging="360"/>
       </w:pPr>
       <w:rPr>
-        <w:rFonts w:ascii="OpenSymbol" w:hAnsi="OpenSymbol" w:cs="OpenSymbol" w:hint="default"/>
+        <w:rFonts w:ascii="Liberation Sans" w:hAnsi="Liberation Sans" w:cs="Liberation Sans" w:hint="default"/>
         <w:u w:val="none"/>
       </w:rPr>
     </w:lvl>
@@ -1017,7 +1017,7 @@
         <w:ind w:left="6480" w:hanging="360"/>
       </w:pPr>
       <w:rPr>
-        <w:rFonts w:ascii="OpenSymbol" w:hAnsi="OpenSymbol" w:cs="OpenSymbol" w:hint="default"/>
+        <w:rFonts w:ascii="Liberation Sans" w:hAnsi="Liberation Sans" w:cs="Liberation Sans" w:hint="default"/>
         <w:u w:val="none"/>
       </w:rPr>
     </w:lvl>
@@ -1067,7 +1067,7 @@
         <w:ind w:left="2160" w:hanging="360"/>
       </w:pPr>
       <w:rPr>
-        <w:rFonts w:ascii="OpenSymbol" w:hAnsi="OpenSymbol" w:cs="OpenSymbol" w:hint="default"/>
+        <w:rFonts w:ascii="Liberation Sans" w:hAnsi="Liberation Sans" w:cs="Liberation Sans" w:hint="default"/>
         <w:u w:val="none"/>
       </w:rPr>
     </w:lvl>
@@ -1115,7 +1115,7 @@
         <w:ind w:left="4320" w:hanging="360"/>
       </w:pPr>
       <w:rPr>
-        <w:rFonts w:ascii="OpenSymbol" w:hAnsi="OpenSymbol" w:cs="OpenSymbol" w:hint="default"/>
+        <w:rFonts w:ascii="Liberation Sans" w:hAnsi="Liberation Sans" w:cs="Liberation Sans" w:hint="default"/>
         <w:u w:val="none"/>
       </w:rPr>
     </w:lvl>
@@ -1163,7 +1163,7 @@
         <w:ind w:left="6480" w:hanging="360"/>
       </w:pPr>
       <w:rPr>
-        <w:rFonts w:ascii="OpenSymbol" w:hAnsi="OpenSymbol" w:cs="OpenSymbol" w:hint="default"/>
+        <w:rFonts w:ascii="Liberation Sans" w:hAnsi="Liberation Sans" w:cs="Liberation Sans" w:hint="default"/>
         <w:u w:val="none"/>
       </w:rPr>
     </w:lvl>
@@ -1307,7 +1307,7 @@
   <w:docDefaults>
     <w:rPrDefault>
       <w:rPr>
-        <w:rFonts w:ascii="Cambria" w:hAnsi="Cambria" w:eastAsia="Cambria" w:cs="Cambria"/>
+        <w:rFonts w:ascii="Liberation Serif" w:hAnsi="Liberation Serif" w:eastAsia="Liberation Serif" w:cs="Liberation Serif"/>
         <w:sz w:val="22"/>
         <w:szCs w:val="22"/>
         <w:lang w:val="en-US" w:eastAsia="zh-CN" w:bidi="hi-IN"/>
@@ -1331,7 +1331,7 @@
       <w:jc w:val="left"/>
     </w:pPr>
     <w:rPr>
-      <w:rFonts w:ascii="Cambria" w:hAnsi="Cambria" w:eastAsia="Cambria" w:cs="Cambria"/>
+      <w:rFonts w:ascii="Liberation Serif" w:hAnsi="Liberation Serif" w:eastAsia="Liberation Serif" w:cs="Liberation Serif"/>
       <w:color w:val="auto"/>
       <w:kern w:val="0"/>
       <w:sz w:val="22"/>
@@ -1354,7 +1354,7 @@
       <w:outlineLvl w:val="0"/>
     </w:pPr>
     <w:rPr>
-      <w:rFonts w:ascii="Calibri" w:hAnsi="Calibri" w:eastAsia="" w:cs="" w:asciiTheme="majorHAnsi" w:cstheme="majorBidi" w:eastAsiaTheme="majorEastAsia" w:hAnsiTheme="majorHAnsi"/>
+      <w:rFonts w:ascii="Liberation Sans" w:hAnsi="Liberation Sans" w:eastAsia="" w:cs="" w:asciiTheme="majorHAnsi" w:cstheme="majorBidi" w:eastAsiaTheme="majorEastAsia" w:hAnsiTheme="majorHAnsi"/>
       <w:b/>
       <w:bCs/>
       <w:color w:themeColor="accent1" w:themeShade="bf" w:val="365F91"/>
@@ -1378,7 +1378,7 @@
       <w:outlineLvl w:val="1"/>
     </w:pPr>
     <w:rPr>
-      <w:rFonts w:ascii="Calibri" w:hAnsi="Calibri" w:eastAsia="" w:cs="" w:asciiTheme="majorHAnsi" w:cstheme="majorBidi" w:eastAsiaTheme="majorEastAsia" w:hAnsiTheme="majorHAnsi"/>
+      <w:rFonts w:ascii="Liberation Sans" w:hAnsi="Liberation Sans" w:eastAsia="" w:cs="" w:asciiTheme="majorHAnsi" w:cstheme="majorBidi" w:eastAsiaTheme="majorEastAsia" w:hAnsiTheme="majorHAnsi"/>
       <w:b/>
       <w:bCs/>
       <w:color w:themeColor="accent1" w:val="4F81BD"/>
@@ -1402,7 +1402,7 @@
       <w:outlineLvl w:val="2"/>
     </w:pPr>
     <w:rPr>
-      <w:rFonts w:ascii="Calibri" w:hAnsi="Calibri" w:eastAsia="" w:cs="" w:asciiTheme="majorHAnsi" w:cstheme="majorBidi" w:eastAsiaTheme="majorEastAsia" w:hAnsiTheme="majorHAnsi"/>
+      <w:rFonts w:ascii="Liberation Sans" w:hAnsi="Liberation Sans" w:eastAsia="" w:cs="" w:asciiTheme="majorHAnsi" w:cstheme="majorBidi" w:eastAsiaTheme="majorEastAsia" w:hAnsiTheme="majorHAnsi"/>
       <w:b/>
       <w:bCs/>
       <w:color w:themeColor="accent1" w:val="4F81BD"/>
@@ -1425,7 +1425,7 @@
       <w:outlineLvl w:val="3"/>
     </w:pPr>
     <w:rPr>
-      <w:rFonts w:ascii="Calibri" w:hAnsi="Calibri" w:eastAsia="" w:cs="" w:asciiTheme="majorHAnsi" w:cstheme="majorBidi" w:eastAsiaTheme="majorEastAsia" w:hAnsiTheme="majorHAnsi"/>
+      <w:rFonts w:ascii="Liberation Sans" w:hAnsi="Liberation Sans" w:eastAsia="" w:cs="" w:asciiTheme="majorHAnsi" w:cstheme="majorBidi" w:eastAsiaTheme="majorEastAsia" w:hAnsiTheme="majorHAnsi"/>
       <w:b/>
       <w:bCs/>
       <w:i/>
@@ -1450,7 +1450,7 @@
       <w:outlineLvl w:val="4"/>
     </w:pPr>
     <w:rPr>
-      <w:rFonts w:ascii="Calibri" w:hAnsi="Calibri" w:eastAsia="" w:cs="" w:asciiTheme="majorHAnsi" w:cstheme="majorBidi" w:eastAsiaTheme="majorEastAsia" w:hAnsiTheme="majorHAnsi"/>
+      <w:rFonts w:ascii="Liberation Sans" w:hAnsi="Liberation Sans" w:eastAsia="" w:cs="" w:asciiTheme="majorHAnsi" w:cstheme="majorBidi" w:eastAsiaTheme="majorEastAsia" w:hAnsiTheme="majorHAnsi"/>
       <w:color w:themeColor="accent1" w:themeShade="7f" w:val="243F60"/>
     </w:rPr>
   </w:style>
@@ -1471,7 +1471,7 @@
       <w:outlineLvl w:val="5"/>
     </w:pPr>
     <w:rPr>
-      <w:rFonts w:ascii="Calibri" w:hAnsi="Calibri" w:eastAsia="" w:cs="" w:asciiTheme="majorHAnsi" w:cstheme="majorBidi" w:eastAsiaTheme="majorEastAsia" w:hAnsiTheme="majorHAnsi"/>
+      <w:rFonts w:ascii="Liberation Sans" w:hAnsi="Liberation Sans" w:eastAsia="" w:cs="" w:asciiTheme="majorHAnsi" w:cstheme="majorBidi" w:eastAsiaTheme="majorEastAsia" w:hAnsiTheme="majorHAnsi"/>
       <w:i/>
       <w:iCs/>
       <w:color w:themeColor="accent1" w:themeShade="7f" w:val="243F60"/>
@@ -1494,7 +1494,7 @@
       <w:outlineLvl w:val="6"/>
     </w:pPr>
     <w:rPr>
-      <w:rFonts w:ascii="Calibri" w:hAnsi="Calibri" w:eastAsia="" w:cs="" w:asciiTheme="majorHAnsi" w:cstheme="majorBidi" w:eastAsiaTheme="majorEastAsia" w:hAnsiTheme="majorHAnsi"/>
+      <w:rFonts w:ascii="Liberation Sans" w:hAnsi="Liberation Sans" w:eastAsia="" w:cs="" w:asciiTheme="majorHAnsi" w:cstheme="majorBidi" w:eastAsiaTheme="majorEastAsia" w:hAnsiTheme="majorHAnsi"/>
       <w:i/>
       <w:iCs/>
       <w:color w:themeColor="text1" w:themeTint="bf" w:val="404040"/>
@@ -1517,7 +1517,7 @@
       <w:outlineLvl w:val="7"/>
     </w:pPr>
     <w:rPr>
-      <w:rFonts w:ascii="Calibri" w:hAnsi="Calibri" w:eastAsia="" w:cs="" w:asciiTheme="majorHAnsi" w:cstheme="majorBidi" w:eastAsiaTheme="majorEastAsia" w:hAnsiTheme="majorHAnsi"/>
+      <w:rFonts w:ascii="Liberation Sans" w:hAnsi="Liberation Sans" w:eastAsia="" w:cs="" w:asciiTheme="majorHAnsi" w:cstheme="majorBidi" w:eastAsiaTheme="majorEastAsia" w:hAnsiTheme="majorHAnsi"/>
       <w:color w:themeColor="accent1" w:val="4F81BD"/>
       <w:sz w:val="20"/>
       <w:szCs w:val="20"/>
@@ -1540,7 +1540,7 @@
       <w:outlineLvl w:val="8"/>
     </w:pPr>
     <w:rPr>
-      <w:rFonts w:ascii="Calibri" w:hAnsi="Calibri" w:eastAsia="" w:cs="" w:asciiTheme="majorHAnsi" w:cstheme="majorBidi" w:eastAsiaTheme="majorEastAsia" w:hAnsiTheme="majorHAnsi"/>
+      <w:rFonts w:ascii="Liberation Sans" w:hAnsi="Liberation Sans" w:eastAsia="" w:cs="" w:asciiTheme="majorHAnsi" w:cstheme="majorBidi" w:eastAsiaTheme="majorEastAsia" w:hAnsiTheme="majorHAnsi"/>
       <w:i/>
       <w:iCs/>
       <w:color w:themeColor="text1" w:themeTint="bf" w:val="404040"/>
@@ -1579,7 +1579,7 @@
     <w:qFormat/>
     <w:rsid w:val="00fc693f"/>
     <w:rPr>
-      <w:rFonts w:ascii="Calibri" w:hAnsi="Calibri" w:eastAsia="" w:cs="" w:asciiTheme="majorHAnsi" w:cstheme="majorBidi" w:eastAsiaTheme="majorEastAsia" w:hAnsiTheme="majorHAnsi"/>
+      <w:rFonts w:ascii="Liberation Sans" w:hAnsi="Liberation Sans" w:eastAsia="" w:cs="" w:asciiTheme="majorHAnsi" w:cstheme="majorBidi" w:eastAsiaTheme="majorEastAsia" w:hAnsiTheme="majorHAnsi"/>
       <w:b/>
       <w:bCs/>
       <w:color w:themeColor="accent1" w:themeShade="bf" w:val="365F91"/>
@@ -1594,7 +1594,7 @@
     <w:qFormat/>
     <w:rsid w:val="00fc693f"/>
     <w:rPr>
-      <w:rFonts w:ascii="Calibri" w:hAnsi="Calibri" w:eastAsia="" w:cs="" w:asciiTheme="majorHAnsi" w:cstheme="majorBidi" w:eastAsiaTheme="majorEastAsia" w:hAnsiTheme="majorHAnsi"/>
+      <w:rFonts w:ascii="Liberation Sans" w:hAnsi="Liberation Sans" w:eastAsia="" w:cs="" w:asciiTheme="majorHAnsi" w:cstheme="majorBidi" w:eastAsiaTheme="majorEastAsia" w:hAnsiTheme="majorHAnsi"/>
       <w:b/>
       <w:bCs/>
       <w:color w:themeColor="accent1" w:val="4F81BD"/>
@@ -1609,7 +1609,7 @@
     <w:qFormat/>
     <w:rsid w:val="00fc693f"/>
     <w:rPr>
-      <w:rFonts w:ascii="Calibri" w:hAnsi="Calibri" w:eastAsia="" w:cs="" w:asciiTheme="majorHAnsi" w:cstheme="majorBidi" w:eastAsiaTheme="majorEastAsia" w:hAnsiTheme="majorHAnsi"/>
+      <w:rFonts w:ascii="Liberation Sans" w:hAnsi="Liberation Sans" w:eastAsia="" w:cs="" w:asciiTheme="majorHAnsi" w:cstheme="majorBidi" w:eastAsiaTheme="majorEastAsia" w:hAnsiTheme="majorHAnsi"/>
       <w:b/>
       <w:bCs/>
       <w:color w:themeColor="accent1" w:val="4F81BD"/>
@@ -1622,7 +1622,7 @@
     <w:qFormat/>
     <w:rsid w:val="00fc693f"/>
     <w:rPr>
-      <w:rFonts w:ascii="Calibri" w:hAnsi="Calibri" w:eastAsia="" w:cs="" w:asciiTheme="majorHAnsi" w:cstheme="majorBidi" w:eastAsiaTheme="majorEastAsia" w:hAnsiTheme="majorHAnsi"/>
+      <w:rFonts w:ascii="Liberation Sans" w:hAnsi="Liberation Sans" w:eastAsia="" w:cs="" w:asciiTheme="majorHAnsi" w:cstheme="majorBidi" w:eastAsiaTheme="majorEastAsia" w:hAnsiTheme="majorHAnsi"/>
       <w:color w:themeColor="text2" w:themeShade="bf" w:val="17365D"/>
       <w:spacing w:val="5"/>
       <w:kern w:val="2"/>
@@ -1637,7 +1637,7 @@
     <w:qFormat/>
     <w:rsid w:val="00fc693f"/>
     <w:rPr>
-      <w:rFonts w:ascii="Calibri" w:hAnsi="Calibri" w:eastAsia="" w:cs="" w:asciiTheme="majorHAnsi" w:cstheme="majorBidi" w:eastAsiaTheme="majorEastAsia" w:hAnsiTheme="majorHAnsi"/>
+      <w:rFonts w:ascii="Liberation Sans" w:hAnsi="Liberation Sans" w:eastAsia="" w:cs="" w:asciiTheme="majorHAnsi" w:cstheme="majorBidi" w:eastAsiaTheme="majorEastAsia" w:hAnsiTheme="majorHAnsi"/>
       <w:i/>
       <w:iCs/>
       <w:color w:themeColor="accent1" w:val="4F81BD"/>
@@ -1683,7 +1683,7 @@
     <w:qFormat/>
     <w:rsid w:val="0029639d"/>
     <w:rPr>
-      <w:rFonts w:ascii="Courier" w:hAnsi="Courier"/>
+      <w:rFonts w:ascii="Liberation Mono" w:hAnsi="Liberation Mono"/>
       <w:sz w:val="20"/>
       <w:szCs w:val="20"/>
     </w:rPr>
@@ -1709,7 +1709,7 @@
     <w:qFormat/>
     <w:rsid w:val="00fc693f"/>
     <w:rPr>
-      <w:rFonts w:ascii="Calibri" w:hAnsi="Calibri" w:eastAsia="" w:cs="" w:asciiTheme="majorHAnsi" w:cstheme="majorBidi" w:eastAsiaTheme="majorEastAsia" w:hAnsiTheme="majorHAnsi"/>
+      <w:rFonts w:ascii="Liberation Sans" w:hAnsi="Liberation Sans" w:eastAsia="" w:cs="" w:asciiTheme="majorHAnsi" w:cstheme="majorBidi" w:eastAsiaTheme="majorEastAsia" w:hAnsiTheme="majorHAnsi"/>
       <w:b/>
       <w:bCs/>
       <w:i/>
@@ -1725,7 +1725,7 @@
     <w:qFormat/>
     <w:rsid w:val="00fc693f"/>
     <w:rPr>
-      <w:rFonts w:ascii="Calibri" w:hAnsi="Calibri" w:eastAsia="" w:cs="" w:asciiTheme="majorHAnsi" w:cstheme="majorBidi" w:eastAsiaTheme="majorEastAsia" w:hAnsiTheme="majorHAnsi"/>
+      <w:rFonts w:ascii="Liberation Sans" w:hAnsi="Liberation Sans" w:eastAsia="" w:cs="" w:asciiTheme="majorHAnsi" w:cstheme="majorBidi" w:eastAsiaTheme="majorEastAsia" w:hAnsiTheme="majorHAnsi"/>
       <w:color w:themeColor="accent1" w:themeShade="7f" w:val="243F60"/>
     </w:rPr>
   </w:style>
@@ -1737,7 +1737,7 @@
     <w:qFormat/>
     <w:rsid w:val="00fc693f"/>
     <w:rPr>
-      <w:rFonts w:ascii="Calibri" w:hAnsi="Calibri" w:eastAsia="" w:cs="" w:asciiTheme="majorHAnsi" w:cstheme="majorBidi" w:eastAsiaTheme="majorEastAsia" w:hAnsiTheme="majorHAnsi"/>
+      <w:rFonts w:ascii="Liberation Sans" w:hAnsi="Liberation Sans" w:eastAsia="" w:cs="" w:asciiTheme="majorHAnsi" w:cstheme="majorBidi" w:eastAsiaTheme="majorEastAsia" w:hAnsiTheme="majorHAnsi"/>
       <w:i/>
       <w:iCs/>
       <w:color w:themeColor="accent1" w:themeShade="7f" w:val="243F60"/>
@@ -1751,7 +1751,7 @@
     <w:qFormat/>
     <w:rsid w:val="00fc693f"/>
     <w:rPr>
-      <w:rFonts w:ascii="Calibri" w:hAnsi="Calibri" w:eastAsia="" w:cs="" w:asciiTheme="majorHAnsi" w:cstheme="majorBidi" w:eastAsiaTheme="majorEastAsia" w:hAnsiTheme="majorHAnsi"/>
+      <w:rFonts w:ascii="Liberation Sans" w:hAnsi="Liberation Sans" w:eastAsia="" w:cs="" w:asciiTheme="majorHAnsi" w:cstheme="majorBidi" w:eastAsiaTheme="majorEastAsia" w:hAnsiTheme="majorHAnsi"/>
       <w:i/>
       <w:iCs/>
       <w:color w:themeColor="text1" w:themeTint="bf" w:val="404040"/>
@@ -1765,7 +1765,7 @@
     <w:qFormat/>
     <w:rsid w:val="00fc693f"/>
     <w:rPr>
-      <w:rFonts w:ascii="Calibri" w:hAnsi="Calibri" w:eastAsia="" w:cs="" w:asciiTheme="majorHAnsi" w:cstheme="majorBidi" w:eastAsiaTheme="majorEastAsia" w:hAnsiTheme="majorHAnsi"/>
+      <w:rFonts w:ascii="Liberation Sans" w:hAnsi="Liberation Sans" w:eastAsia="" w:cs="" w:asciiTheme="majorHAnsi" w:cstheme="majorBidi" w:eastAsiaTheme="majorEastAsia" w:hAnsiTheme="majorHAnsi"/>
       <w:color w:themeColor="accent1" w:val="4F81BD"/>
       <w:sz w:val="20"/>
       <w:szCs w:val="20"/>
@@ -1779,7 +1779,7 @@
     <w:qFormat/>
     <w:rsid w:val="00fc693f"/>
     <w:rPr>
-      <w:rFonts w:ascii="Calibri" w:hAnsi="Calibri" w:eastAsia="" w:cs="" w:asciiTheme="majorHAnsi" w:cstheme="majorBidi" w:eastAsiaTheme="majorEastAsia" w:hAnsiTheme="majorHAnsi"/>
+      <w:rFonts w:ascii="Liberation Sans" w:hAnsi="Liberation Sans" w:eastAsia="" w:cs="" w:asciiTheme="majorHAnsi" w:cstheme="majorBidi" w:eastAsiaTheme="majorEastAsia" w:hAnsiTheme="majorHAnsi"/>
       <w:i/>
       <w:iCs/>
       <w:color w:themeColor="text1" w:themeTint="bf" w:val="404040"/>
@@ -1909,7 +1909,7 @@
     <w:name w:val="Marcadores"/>
     <w:qFormat/>
     <w:rPr>
-      <w:rFonts w:ascii="OpenSymbol" w:hAnsi="OpenSymbol" w:eastAsia="OpenSymbol" w:cs="OpenSymbol"/>
+      <w:rFonts w:ascii="Liberation Sans" w:hAnsi="Liberation Sans" w:eastAsia="Liberation Sans" w:cs="Liberation Sans"/>
     </w:rPr>
   </w:style>
   <w:style w:type="character" w:styleId="Smbolosdenumerao">
@@ -2006,7 +2006,7 @@
       <w:jc w:val="left"/>
     </w:pPr>
     <w:rPr>
-      <w:rFonts w:ascii="Cambria" w:hAnsi="Cambria" w:eastAsia="Cambria" w:cs="Cambria"/>
+      <w:rFonts w:ascii="Liberation Serif" w:hAnsi="Liberation Serif" w:eastAsia="Liberation Serif" w:cs="Liberation Serif"/>
       <w:color w:val="auto"/>
       <w:kern w:val="0"/>
       <w:sz w:val="22"/>
@@ -2030,7 +2030,7 @@
       <w:contextualSpacing/>
     </w:pPr>
     <w:rPr>
-      <w:rFonts w:ascii="Calibri" w:hAnsi="Calibri" w:eastAsia="" w:cs="" w:asciiTheme="majorHAnsi" w:cstheme="majorBidi" w:eastAsiaTheme="majorEastAsia" w:hAnsiTheme="majorHAnsi"/>
+      <w:rFonts w:ascii="Liberation Sans" w:hAnsi="Liberation Sans" w:eastAsia="" w:cs="" w:asciiTheme="majorHAnsi" w:cstheme="majorBidi" w:eastAsiaTheme="majorEastAsia" w:hAnsiTheme="majorHAnsi"/>
       <w:color w:themeColor="text2" w:themeShade="bf" w:val="17365D"/>
       <w:spacing w:val="5"/>
       <w:kern w:val="2"/>
@@ -2092,7 +2092,7 @@
       <w:jc w:val="left"/>
     </w:pPr>
     <w:rPr>
-      <w:rFonts w:ascii="Cambria" w:hAnsi="Cambria" w:eastAsia="Cambria" w:cs="Cambria"/>
+      <w:rFonts w:ascii="Liberation Serif" w:hAnsi="Liberation Serif" w:eastAsia="Liberation Serif" w:cs="Liberation Serif"/>
       <w:color w:val="auto"/>
       <w:kern w:val="0"/>
       <w:sz w:val="22"/>
@@ -2110,7 +2110,7 @@
     <w:rsid w:val="00fc693f"/>
     <w:pPr/>
     <w:rPr>
-      <w:rFonts w:ascii="Calibri" w:hAnsi="Calibri" w:eastAsia="Calibri" w:cs="Calibri"/>
+      <w:rFonts w:ascii="Liberation Sans" w:hAnsi="Liberation Sans" w:eastAsia="Liberation Sans" w:cs="Liberation Sans"/>
       <w:i/>
       <w:color w:val="4F81BD"/>
       <w:sz w:val="24"/>
@@ -2335,7 +2335,7 @@
       <w:jc w:val="left"/>
     </w:pPr>
     <w:rPr>
-      <w:rFonts w:ascii="Courier" w:hAnsi="Courier" w:eastAsia="Cambria" w:cs="Cambria"/>
+      <w:rFonts w:ascii="Liberation Mono" w:hAnsi="Liberation Mono" w:eastAsia="Liberation Serif" w:cs="Liberation Serif"/>
       <w:color w:val="auto"/>
       <w:kern w:val="0"/>
       <w:sz w:val="20"/>
@@ -13183,12 +13183,12 @@
     </a:clrScheme>
     <a:fontScheme name="Office">
       <a:majorFont>
-        <a:latin typeface="Calibri" pitchFamily="0" charset="1"/>
+        <a:latin typeface="Liberation Sans" pitchFamily="0" charset="1"/>
         <a:ea typeface=""/>
         <a:cs typeface=""/>
       </a:majorFont>
       <a:minorFont>
-        <a:latin typeface="Cambria" pitchFamily="0" charset="1"/>
+        <a:latin typeface="Liberation Serif" pitchFamily="0" charset="1"/>
         <a:ea typeface=""/>
         <a:cs typeface=""/>
       </a:minorFont>

</xml_diff>